<commit_message>
mis à jour les documents
</commit_message>
<xml_diff>
--- a/emails/Modèle 1 Approche Générale (EN).docx
+++ b/emails/Modèle 1 Approche Générale (EN).docx
@@ -22,6 +22,7 @@
           <w:pgNumType w:fmt="decimal"/>
           <w:formProt w:val="false"/>
           <w:textDirection w:val="lrTb"/>
+          <w:docGrid w:type="default" w:linePitch="100" w:charSpace="0"/>
         </w:sectPr>
       </w:pPr>
     </w:p>
@@ -93,17 +94,53 @@
       </w:pPr>
       <w:r>
         <w:rPr/>
-        <w:t xml:space="preserve">Our mission is to train the next generation of engineers by enabling them to design tangible electronic systems, from concept to functional prototype. Following successful projects like the "Hacker Mouse" and the "PCB Ruler", we are launching our most ambitious challenge this winter: the creation of a </w:t>
-      </w:r>
-      <w:r>
-        <w:rPr>
-          <w:b/>
-        </w:rPr>
-        <w:t>"Smart Wearable"</w:t>
-      </w:r>
-      <w:r>
-        <w:rPr/>
-        <w:t xml:space="preserve"> device.</w:t>
+        <w:t xml:space="preserve">Our mission is to train the next generation of engineers by enabling them to design tangible electronic systems, from concept to functional prototype. Following successful projects like the "Hacker Mouse", we are </w:t>
+      </w:r>
+      <w:r>
+        <w:rPr/>
+        <w:t>re</w:t>
+      </w:r>
+      <w:r>
+        <w:rPr/>
+        <w:t>launching o</w:t>
+      </w:r>
+      <w:r>
+        <w:rPr/>
+        <w:t>ne of our favorite</w:t>
+      </w:r>
+      <w:r>
+        <w:rPr/>
+        <w:t xml:space="preserve"> challenge this </w:t>
+      </w:r>
+      <w:r>
+        <w:rPr/>
+        <w:t>fall</w:t>
+      </w:r>
+      <w:r>
+        <w:rPr/>
+        <w:t xml:space="preserve">: the creation of a </w:t>
+      </w:r>
+      <w:r>
+        <w:rPr>
+          <w:b/>
+        </w:rPr>
+        <w:t>"</w:t>
+      </w:r>
+      <w:r>
+        <w:rPr>
+          <w:b/>
+        </w:rPr>
+        <w:t>PCB Ruler</w:t>
+      </w:r>
+      <w:r>
+        <w:rPr>
+          <w:b/>
+        </w:rPr>
+        <w:t>"</w:t>
+      </w:r>
+      <w:r>
+        <w:rPr/>
+        <w:t>.</w:t>
       </w:r>
     </w:p>
     <w:p>
@@ -218,6 +255,7 @@
       <w:pgMar w:left="1134" w:right="1134" w:gutter="0" w:header="0" w:top="1134" w:footer="0" w:bottom="1134"/>
       <w:formProt w:val="false"/>
       <w:textDirection w:val="lrTb"/>
+      <w:docGrid w:type="default" w:linePitch="100" w:charSpace="0"/>
     </w:sectPr>
   </w:body>
 </w:document>
@@ -237,7 +275,6 @@
     </w:rPrDefault>
     <w:pPrDefault>
       <w:pPr>
-        <w:widowControl/>
         <w:suppressAutoHyphens w:val="true"/>
       </w:pPr>
     </w:pPrDefault>
@@ -247,7 +284,10 @@
     <w:qFormat/>
     <w:pPr>
       <w:widowControl/>
+      <w:suppressAutoHyphens w:val="true"/>
       <w:bidi w:val="0"/>
+      <w:spacing w:before="0" w:after="0"/>
+      <w:jc w:val="start"/>
     </w:pPr>
     <w:rPr>
       <w:rFonts w:ascii="Liberation Serif" w:hAnsi="Liberation Serif" w:eastAsia="Noto Serif CJK SC" w:cs="Noto Sans Devanagari"/>
@@ -260,7 +300,7 @@
   </w:style>
   <w:style w:type="paragraph" w:styleId="Heading3">
     <w:name w:val="heading 3"/>
-    <w:basedOn w:val="Titre"/>
+    <w:basedOn w:val="Titreuser"/>
     <w:next w:val="BodyText"/>
     <w:qFormat/>
     <w:pPr>
@@ -275,8 +315,8 @@
       <w:szCs w:val="28"/>
     </w:rPr>
   </w:style>
-  <w:style w:type="character" w:styleId="Textesource">
-    <w:name w:val="Texte source"/>
+  <w:style w:type="character" w:styleId="Textesourceuser">
+    <w:name w:val="Texte source (user)"/>
     <w:qFormat/>
     <w:rPr>
       <w:rFonts w:ascii="Liberation Mono" w:hAnsi="Liberation Mono" w:eastAsia="Noto Sans Mono CJK SC" w:cs="Liberation Mono"/>
@@ -340,8 +380,23 @@
       <w:rFonts w:cs="Noto Sans Devanagari"/>
     </w:rPr>
   </w:style>
-  <w:style w:type="paragraph" w:styleId="Lignehorizontale">
-    <w:name w:val="Ligne horizontale"/>
+  <w:style w:type="paragraph" w:styleId="Titreuser">
+    <w:name w:val="Titre (user)"/>
+    <w:basedOn w:val="Normal"/>
+    <w:next w:val="BodyText"/>
+    <w:qFormat/>
+    <w:pPr>
+      <w:keepNext w:val="true"/>
+      <w:spacing w:before="240" w:after="120"/>
+    </w:pPr>
+    <w:rPr>
+      <w:rFonts w:ascii="Liberation Sans" w:hAnsi="Liberation Sans" w:eastAsia="Noto Sans CJK SC" w:cs="Noto Sans Devanagari"/>
+      <w:sz w:val="28"/>
+      <w:szCs w:val="28"/>
+    </w:rPr>
+  </w:style>
+  <w:style w:type="paragraph" w:styleId="Lignehorizontaleuser">
+    <w:name w:val="Ligne horizontale (user)"/>
     <w:basedOn w:val="Normal"/>
     <w:next w:val="BodyText"/>
     <w:qFormat/>
@@ -368,37 +423,37 @@
         <a:srgbClr val="000000"/>
       </a:dk1>
       <a:lt1>
-        <a:srgbClr val="ffffff"/>
+        <a:srgbClr val="FFFFFF"/>
       </a:lt1>
       <a:dk2>
         <a:srgbClr val="000000"/>
       </a:dk2>
       <a:lt2>
-        <a:srgbClr val="ffffff"/>
+        <a:srgbClr val="FFFFFF"/>
       </a:lt2>
       <a:accent1>
-        <a:srgbClr val="18a303"/>
+        <a:srgbClr val="18A303"/>
       </a:accent1>
       <a:accent2>
-        <a:srgbClr val="0369a3"/>
+        <a:srgbClr val="0369A3"/>
       </a:accent2>
       <a:accent3>
-        <a:srgbClr val="a33e03"/>
+        <a:srgbClr val="A33E03"/>
       </a:accent3>
       <a:accent4>
-        <a:srgbClr val="8e03a3"/>
+        <a:srgbClr val="8E03A3"/>
       </a:accent4>
       <a:accent5>
-        <a:srgbClr val="c99c00"/>
+        <a:srgbClr val="C99C00"/>
       </a:accent5>
       <a:accent6>
-        <a:srgbClr val="c9211e"/>
+        <a:srgbClr val="C9211E"/>
       </a:accent6>
       <a:hlink>
-        <a:srgbClr val="0000ee"/>
+        <a:srgbClr val="0000EE"/>
       </a:hlink>
       <a:folHlink>
-        <a:srgbClr val="551a8b"/>
+        <a:srgbClr val="551A8B"/>
       </a:folHlink>
     </a:clrScheme>
     <a:fontScheme name="Office">

</xml_diff>